<commit_message>
Reuploaded Attachments - fixed bugs in docs-en translation
</commit_message>
<xml_diff>
--- a/.github/assets/docs/docx/Among Bots Abschlussbericht-en.docx
+++ b/.github/assets/docs/docx/Among Bots Abschlussbericht-en.docx
@@ -1042,7 +1042,32 @@
           <w:vertAlign w:val="baseline"/>
           <w:rtl w:val="0"/>
         </w:rPr>
-        <w:t xml:space="preserve">– UI Programming – GitHub Datum: Februar 9. 2026</w:t>
+        <w:t xml:space="preserve">– UI Programming – GitHub Dat</w:t>
+      </w:r>
+      <w:r>
+        <w:rPr>
+          <w:rtl w:val="0"/>
+        </w:rPr>
+        <w:t xml:space="preserve">e</w:t>
+      </w:r>
+      <w:r>
+        <w:rPr>
+          <w:rFonts w:ascii="Cambria" w:cs="Cambria" w:eastAsia="Cambria" w:hAnsi="Cambria"/>
+          <w:b w:val="0"/>
+          <w:bCs w:val="0"/>
+          <w:i w:val="0"/>
+          <w:iCs w:val="0"/>
+          <w:smallCaps w:val="0"/>
+          <w:strike w:val="0"/>
+          <w:color w:val="000000"/>
+          <w:sz w:val="22"/>
+          <w:szCs w:val="22"/>
+          <w:u w:val="none"/>
+          <w:shd w:fill="auto" w:val="clear"/>
+          <w:vertAlign w:val="baseline"/>
+          <w:rtl w:val="0"/>
+        </w:rPr>
+        <w:t xml:space="preserve">: February 9. 2026</w:t>
       </w:r>
     </w:p>
     <w:p>
@@ -5043,7 +5068,7 @@
           <w:color w:val="365f91"/>
           <w:rtl w:val="0"/>
         </w:rPr>
-        <w:t xml:space="preserve">Datenschutz &amp; Moderation</w:t>
+        <w:t xml:space="preserve">Data Protection &amp; Moderation</w:t>
       </w:r>
       <w:r>
         <w:rPr>
@@ -6440,28 +6465,9 @@
       </w:pPr>
       <w:r>
         <w:rPr>
-          <w:rFonts w:ascii="Cambria" w:cs="Cambria" w:eastAsia="Cambria" w:hAnsi="Cambria"/>
-          <w:b w:val="0"/>
-          <w:bCs w:val="0"/>
-          <w:i w:val="0"/>
-          <w:iCs w:val="0"/>
-          <w:smallCaps w:val="0"/>
-          <w:strike w:val="0"/>
-          <w:color w:val="000000"/>
-          <w:sz w:val="22"/>
-          <w:szCs w:val="22"/>
-          <w:u w:val="none"/>
-          <w:shd w:fill="auto" w:val="clear"/>
-          <w:vertAlign w:val="baseline"/>
-          <w:rtl w:val="0"/>
-        </w:rPr>
-        <w:t xml:space="preserve">Clients senden Aktionen (join, submit, vote, etc.) an den Server</w:t>
-      </w:r>
-      <w:r>
-        <w:rPr>
-          <w:rtl w:val="0"/>
-        </w:rPr>
-        <w:t xml:space="preserve">.</w:t>
+          <w:rtl w:val="0"/>
+        </w:rPr>
+        <w:t xml:space="preserve">Clients send actions (join, submit, vote, etc.) to the server.</w:t>
       </w:r>
       <w:r>
         <w:rPr>
@@ -6764,7 +6770,7 @@
           <w:color w:val="4f81bc"/>
           <w:rtl w:val="0"/>
         </w:rPr>
-        <w:t xml:space="preserve">Game Logik</w:t>
+        <w:t xml:space="preserve">Game Logic</w:t>
       </w:r>
       <w:r>
         <w:rPr>
@@ -8050,7 +8056,7 @@
           <w:vertAlign w:val="baseline"/>
           <w:rtl w:val="0"/>
         </w:rPr>
-        <w:t xml:space="preserve"> the Frontend (gameStore.ts) </w:t>
+        <w:t xml:space="preserve"> the Frontend (gameStore.ts) t</w:t>
       </w:r>
       <w:r>
         <w:rPr>

</xml_diff>